<commit_message>
Did a ton of cleanup.
</commit_message>
<xml_diff>
--- a/transcripts/Thesis interview Andreea Bulisache.docx
+++ b/transcripts/Thesis interview Andreea Bulisache.docx
@@ -562,7 +562,7 @@
         <w:t xml:space="preserve">Yeah. So I think, uh, uh, for your context, I’m doing grounded theory, so I’m also focusing on finding gaps in what I already know from conversations w- with others. Um, and l- let’s, let’s start with, with you before I di- dive into the use case, by the way. I think that’s still a good structure. Can you tell me a little bit about yourself, uh, yourself and your, your, your role within the company and, and how you got there? Because I think you have a very interesting journey.</w:t>
       </w:r>
     </w:p>
-    <w:bookmarkStart w:id="20" w:name="job-intro"/>
+    <w:bookmarkStart w:id="9" w:name="job-intro"/>
     <w:p>
       <w:pPr>
         <w:pStyle w:val="Heading2"/>
@@ -795,8 +795,8 @@
         <w:t xml:space="preserve">l- let’s start by, with those use cases, because I already have a lot of people who say that they use agentic AI in analyzing marketing data, but not really for anything else. I hear some stories about content pipelines which might be agentic or may, may not be. Um, do you see any other applications of a- agentic AI in, in the marketing context already?</w:t>
       </w:r>
     </w:p>
-    <w:bookmarkEnd w:id="20"/>
-    <w:bookmarkStart w:id="21" w:name="agentic-ai-definition"/>
+    <w:bookmarkEnd w:id="9"/>
+    <w:bookmarkStart w:id="10" w:name="agentic-ai-definition"/>
     <w:p>
       <w:pPr>
         <w:pStyle w:val="Heading2"/>
@@ -889,8 +889,8 @@
         <w:t xml:space="preserve">Yeah. So I, I– That, that is good to ask. I, I always explain this, and I, with you, I was like: I think we’re so on the same page that I pro– can probably skip it. So I define agentic AI a bit broad, so I mainly focus on the, on the ability to act in some way on other systems and the ability to plan. Um, and value is also something that I, uh, define very broadly. So I really look at the value pyramids that you can see in academia, where it can be something like monetary value that you get as an organi- organization directly, but it can also be on the very other side. Like, I feel great because I did something cool, and my manager is also happy about it, right? So it can be e- everything in between that and also customer-facing, just loyal– things that generate loyalty or other things that might be beneficial to, to the company or the people within the company.</w:t>
       </w:r>
     </w:p>
-    <w:bookmarkEnd w:id="21"/>
-    <w:bookmarkStart w:id="22" w:name="use-cases"/>
+    <w:bookmarkEnd w:id="10"/>
+    <w:bookmarkStart w:id="11" w:name="use-cases"/>
     <w:p>
       <w:pPr>
         <w:pStyle w:val="Heading2"/>
@@ -1462,13 +1462,7 @@
         <w:t xml:space="preserve"> </w:t>
       </w:r>
       <w:r>
-        <w:t xml:space="preserve">“</w:t>
-      </w:r>
-      <w:r>
-        <w:t xml:space="preserve">AI helps with,</w:t>
-      </w:r>
-      <w:r>
-        <w:t xml:space="preserve">”</w:t>
+        <w:t xml:space="preserve">“AI helps with,”</w:t>
       </w:r>
       <w:r>
         <w:t xml:space="preserve"> </w:t>
@@ -1480,13 +1474,7 @@
         <w:t xml:space="preserve"> </w:t>
       </w:r>
       <w:r>
-        <w:t xml:space="preserve">“</w:t>
-      </w:r>
-      <w:r>
-        <w:t xml:space="preserve">writing emails,</w:t>
-      </w:r>
-      <w:r>
-        <w:t xml:space="preserve">”</w:t>
+        <w:t xml:space="preserve">“writing emails,”</w:t>
       </w:r>
       <w:r>
         <w:t xml:space="preserve"> </w:t>
@@ -2338,13 +2326,7 @@
         <w:t xml:space="preserve"> </w:t>
       </w:r>
       <w:r>
-        <w:t xml:space="preserve">“</w:t>
-      </w:r>
-      <w:r>
-        <w:t xml:space="preserve">Hey, this might need something, something,</w:t>
-      </w:r>
-      <w:r>
-        <w:t xml:space="preserve">”</w:t>
+        <w:t xml:space="preserve">“Hey, this might need something, something,”</w:t>
       </w:r>
       <w:r>
         <w:t xml:space="preserve"> </w:t>
@@ -2476,7 +2458,7 @@
         <w:t xml:space="preserve"> </w:t>
       </w:r>
       <w:r>
-        <w:t xml:space="preserve">… and in both VCs and PEs, market intelligence, and that would, that would weigh a lot in the due diligence. So that helps you screen the founder and the team, as well as competitive, competitive products. So you use it for market, uh, market research: stellar. Now, in order for any algorithm to determine if there’s something missing, it would have to invoke certain things. The fact that there are already predefined, predefined, um, uh, as in like templatised contracts for the larger PEs and VCs, [notification sound] does allow the Tier 2 small ones to do a similar comparing analysis on, on different categories of, of elements in any given contract compared against. So Sequoia has-</w:t>
+        <w:t xml:space="preserve">… and in both VCs and PEs, market intelligence, and that would, that would weigh a lot in the due diligence. So that helps you screen the founder and the team, as well as competitive, competitive products. So you use it for market, uh, market research: stellar. Now, in order for any algorithm to determine if there’s something missing, it would have to invoke certain things. The fact that there are already predefined, predefined, um, uh, as in like templatised contracts for the larger PEs and VCs, [notification sound] does allow the Tier 2 small ones to do a similar comparing analysis on, on different categories of, of elements in any given contract compared against. So [company] has-</w:t>
       </w:r>
     </w:p>
     <w:p>
@@ -2504,7 +2486,7 @@
         <w:t xml:space="preserve"> </w:t>
       </w:r>
       <w:r>
-        <w:t xml:space="preserve">For example, Sequoia has a, a, a pitch deck. That pitch deck structure [notification sound] you can apply over whatever pitches you’re getting and see what is it that is missing. I can give you a simple example. It just- [notification sound] I work very little with, uh, with the VCs. I used to, with startups, but for the, the ba- main distinction between European, uh, startups and US startups is that in Europe, a lot of founders lead with product. So they try to convince you they have a great product, and it’s feature and so on, and then they look at the venture, uh, uh, as in the investment, to support both with capital for further development, but also market access.</w:t>
+        <w:t xml:space="preserve">For example, [company] has a, a, a pitch deck. That pitch deck structure [notification sound] you can apply over whatever pitches you’re getting and see what is it that is missing. I can give you a simple example. It just- [notification sound] I work very little with, uh, with the VCs. I used to, with startups, but for the, the ba- main distinction between European, uh, startups and US startups is that in Europe, a lot of founders lead with product. So they try to convince you they have a great product, and it’s feature and so on, and then they look at the venture, uh, uh, as in the investment, to support both with capital for further development, but also market access.</w:t>
       </w:r>
     </w:p>
     <w:p>
@@ -3490,13 +3472,7 @@
         <w:t xml:space="preserve"> </w:t>
       </w:r>
       <w:r>
-        <w:t xml:space="preserve">“</w:t>
-      </w:r>
-      <w:r>
-        <w:t xml:space="preserve">Hey, what is– how will my client appreciate good for this particular product?</w:t>
-      </w:r>
-      <w:r>
-        <w:t xml:space="preserve">”</w:t>
+        <w:t xml:space="preserve">“Hey, what is– how will my client appreciate good for this particular product?”</w:t>
       </w:r>
     </w:p>
     <w:p>
@@ -3524,13 +3500,7 @@
         <w:t xml:space="preserve"> </w:t>
       </w:r>
       <w:r>
-        <w:t xml:space="preserve">“</w:t>
-      </w:r>
-      <w:r>
-        <w:t xml:space="preserve">And then where can AI help me understand and operate this better?</w:t>
-      </w:r>
-      <w:r>
-        <w:t xml:space="preserve">”</w:t>
+        <w:t xml:space="preserve">“And then where can AI help me understand and operate this better?”</w:t>
       </w:r>
       <w:r>
         <w:t xml:space="preserve"> </w:t>
@@ -3752,13 +3722,7 @@
         <w:t xml:space="preserve"> </w:t>
       </w:r>
       <w:r>
-        <w:t xml:space="preserve">“</w:t>
-      </w:r>
-      <w:r>
-        <w:t xml:space="preserve">I get people in a room because they want to know something about AI. Then I apply some systems thinking based on the situation of the current world and scenarios that we have, and I sc- just scare them a lot.</w:t>
-      </w:r>
-      <w:r>
-        <w:t xml:space="preserve">”</w:t>
+        <w:t xml:space="preserve">“I get people in a room because they want to know something about AI. Then I apply some systems thinking based on the situation of the current world and scenarios that we have, and I sc- just scare them a lot.”</w:t>
       </w:r>
       <w:r>
         <w:t xml:space="preserve"> </w:t>
@@ -4394,7 +4358,7 @@
         <w:t xml:space="preserve"> </w:t>
       </w:r>
       <w:r>
-        <w:t xml:space="preserve">from, from my side, uh, because also because I have to, uh, I do have a pretty hard end at, at 1:00, I, I would like to wrap it up and also just give you a, a bit of time to… I don’t know if you have any questions to me. I, I found this very enlightening, and it was great to have this talk with you. Uh, also, especially because you have a very different background and view on the matters than the people I’ve talked to, uh, about this before, uh, f- for my thesis then. Um,</w:t>
+        <w:t xml:space="preserve">from, from my side, uh, because also because I have to, uh, I do have a pretty hard end at, at 1:00, I, I would like to [company] it up and also just give you a, a bit of time to… I don’t know if you have any questions to me. I, I found this very enlightening, and it was great to have this talk with you. Uh, also, especially because you have a very different background and view on the matters than the people I’ve talked to, uh, about this before, uh, f- for my thesis then. Um,</w:t>
       </w:r>
     </w:p>
     <w:p>
@@ -4562,7 +4526,7 @@
         <w:t xml:space="preserve"> </w:t>
       </w:r>
       <w:r>
-        <w:t xml:space="preserve">… flows still, and they don’t– They do measure it, but it’s like you– Typically, it’s like a funnel. Like we have five steps-</w:t>
+        <w:t xml:space="preserve">… flows still, and they don’t– They do measure it, but it’s like you– Typically, it’s like a [product]. Like we have five steps-</w:t>
       </w:r>
     </w:p>
     <w:p>
@@ -4590,7 +4554,7 @@
         <w:t xml:space="preserve"> </w:t>
       </w:r>
       <w:r>
-        <w:t xml:space="preserve">… and it’s from top to bottom, and there’s no overview of whatever other elements might come or, uh, what happens if they don’t get guided through the, through that funnel. So there is all these elements in marketing that prevent, uh, the tech from yesterday.</w:t>
+        <w:t xml:space="preserve">… and it’s from top to bottom, and there’s no overview of whatever other elements might come or, uh, what happens if they don’t get guided through the, through that [product]. So there is all these elements in marketing that prevent, uh, the tech from yesterday.</w:t>
       </w:r>
     </w:p>
     <w:p>
@@ -4624,13 +4588,7 @@
         <w:t xml:space="preserve"> </w:t>
       </w:r>
       <w:r>
-        <w:t xml:space="preserve">“</w:t>
-      </w:r>
-      <w:r>
-        <w:t xml:space="preserve">W- what, what are you really doing with it?</w:t>
-      </w:r>
-      <w:r>
-        <w:t xml:space="preserve">”</w:t>
+        <w:t xml:space="preserve">“W- what, what are you really doing with it?”</w:t>
       </w:r>
       <w:r>
         <w:t xml:space="preserve"> </w:t>
@@ -4902,7 +4860,7 @@
         <w:t xml:space="preserve"> </w:t>
       </w:r>
       <w:r>
-        <w:t xml:space="preserve">So they need to find the right balance between offline and, and online. But Lovable has done a great job by simplifying things and humanizing them in a way, um, that has, uh, truly helped. And then if you can look, their, um, investor, uh, decks are available. So you should look… You see how they progress between stages of, uh-</w:t>
+        <w:t xml:space="preserve">So they need to find the right balance between offline and, and online. But [company] has done a great job by simplifying things and humanizing them in a way, um, that has, uh, truly helped. And then if you can look, their, um, investor, uh, decks are available. So you should look… You see how they progress between stages of, uh-</w:t>
       </w:r>
     </w:p>
     <w:p>
@@ -5238,7 +5196,7 @@
         <w:t xml:space="preserve"> </w:t>
       </w:r>
       <w:r>
-        <w:t xml:space="preserve">Yeah, great. And, uh, likewise, if I can help you with anything, also feel free to reach out, and that goes… I saw that you and, uh, I talked with Giorgio before, and Desiree, you all also are engaged with, uh, doing good together, essentially. So I also reached out to Desiree like, “Hey, I, I was thinking about this before I started my MBA. During the MBA, that’s not really feasible, but if you have any advice for me to think about how I can, uh,</w:t>
+        <w:t xml:space="preserve">Yeah, great. And, uh, likewise, if I can help you with anything, also feel free to reach out, and that goes… I saw that you and, uh, I talked with Giorgio before, and [redacted], you all also are engaged with, uh, doing good together, essentially. So I also reached out to [redacted] like, “Hey, I, I was thinking about this before I started my MBA. During the MBA, that’s not really feasible, but if you have any advice for me to think about how I can, uh,</w:t>
       </w:r>
     </w:p>
     <w:p>
@@ -5392,7 +5350,7 @@
         <w:t xml:space="preserve"> </w:t>
       </w:r>
       <w:r>
-        <w:t xml:space="preserve">So I think at some point it’s important to, uh, understand that the privilege that I came from, um, is not similar across the border. So, uh, we have a foundation, as in the chair- Desiree founded, and I’m the chairman of, and then R- uh, Giorgio is also part of, that looks at addressing the intergenerational transfer of disadvantage, knowing that some gener- some communities are by design disadvantaged.</w:t>
+        <w:t xml:space="preserve">So I think at some point it’s important to, uh, understand that the privilege that I came from, um, is not similar across the border. So, uh, we have a foundation, as in the chair- [redacted] founded, and I’m the chairman of, and then R- uh, Giorgio is also part of, that looks at addressing the intergenerational transfer of disadvantage, knowing that some gener- some communities are by design disadvantaged.</w:t>
       </w:r>
     </w:p>
     <w:p>
@@ -5448,7 +5406,7 @@
         <w:t xml:space="preserve"> </w:t>
       </w:r>
       <w:r>
-        <w:t xml:space="preserve">So we’re trying to do some of these things, and happy to talk more and share more once you have the capacity, and we’ll meet in New York, so we’ll probably have a chance to have a coffee in, in New York.</w:t>
+        <w:t xml:space="preserve">So we’re trying to do some of these things, and happy to talk more and share more once you have the capacity, and we’ll meet in [location], so we’ll probably have a chance to have a coffee in, in [location].</w:t>
       </w:r>
     </w:p>
     <w:p>
@@ -5476,7 +5434,7 @@
         <w:t xml:space="preserve"> </w:t>
       </w:r>
       <w:r>
-        <w:t xml:space="preserve">Awesome. Good luck with everything. Thank you, Daan.</w:t>
+        <w:t xml:space="preserve">Awesome. Good luck with everything. Thank you, [redacted].</w:t>
       </w:r>
     </w:p>
     <w:p>
@@ -5521,8 +5479,12 @@
         <w:t xml:space="preserve">[heavy breathing]</w:t>
       </w:r>
     </w:p>
-    <w:bookmarkEnd w:id="22"/>
-    <w:sectPr/>
+    <w:bookmarkEnd w:id="11"/>
+    <w:sectPr>
+      <w:footnotePr>
+        <w:numRestart w:val="eachSect"/>
+      </w:footnotePr>
+    </w:sectPr>
   </w:body>
 </w:document>
 </file>
@@ -5553,14 +5515,14 @@
 <file path=word/numbering.xml><?xml version="1.0" encoding="utf-8"?>
 <w:numbering xmlns:w="http://schemas.openxmlformats.org/wordprocessingml/2006/main">
   <w:abstractNum w:abstractNumId="990">
-    <w:nsid w:val="A990"/>
+    <w:nsid w:val="0000A990"/>
     <w:multiLevelType w:val="multilevel"/>
     <w:lvl w:ilvl="0">
       <w:numFmt w:val="bullet"/>
       <w:lvlText w:val=" "/>
       <w:lvlJc w:val="left"/>
       <w:pPr>
-        <w:ind w:left="720" w:hanging="480"/>
+        <w:ind w:left="720" w:hanging="360"/>
       </w:pPr>
     </w:lvl>
     <w:lvl w:ilvl="1">
@@ -5568,7 +5530,7 @@
       <w:lvlText w:val=" "/>
       <w:lvlJc w:val="left"/>
       <w:pPr>
-        <w:ind w:left="1440" w:hanging="480"/>
+        <w:ind w:left="1440" w:hanging="360"/>
       </w:pPr>
     </w:lvl>
     <w:lvl w:ilvl="2">
@@ -5576,7 +5538,7 @@
       <w:lvlText w:val=" "/>
       <w:lvlJc w:val="left"/>
       <w:pPr>
-        <w:ind w:left="2160" w:hanging="480"/>
+        <w:ind w:left="2160" w:hanging="360"/>
       </w:pPr>
     </w:lvl>
     <w:lvl w:ilvl="3">
@@ -5584,7 +5546,7 @@
       <w:lvlText w:val=" "/>
       <w:lvlJc w:val="left"/>
       <w:pPr>
-        <w:ind w:left="2880" w:hanging="480"/>
+        <w:ind w:left="2880" w:hanging="360"/>
       </w:pPr>
     </w:lvl>
     <w:lvl w:ilvl="4">
@@ -5592,7 +5554,7 @@
       <w:lvlText w:val=" "/>
       <w:lvlJc w:val="left"/>
       <w:pPr>
-        <w:ind w:left="3600" w:hanging="480"/>
+        <w:ind w:left="3600" w:hanging="360"/>
       </w:pPr>
     </w:lvl>
     <w:lvl w:ilvl="5">
@@ -5600,7 +5562,7 @@
       <w:lvlText w:val=" "/>
       <w:lvlJc w:val="left"/>
       <w:pPr>
-        <w:ind w:left="4320" w:hanging="480"/>
+        <w:ind w:left="4320" w:hanging="360"/>
       </w:pPr>
     </w:lvl>
     <w:lvl w:ilvl="6">
@@ -5608,7 +5570,7 @@
       <w:lvlText w:val=" "/>
       <w:lvlJc w:val="left"/>
       <w:pPr>
-        <w:ind w:left="5040" w:hanging="480"/>
+        <w:ind w:left="5040" w:hanging="360"/>
       </w:pPr>
     </w:lvl>
     <w:lvl w:ilvl="7">
@@ -5616,7 +5578,7 @@
       <w:lvlText w:val=" "/>
       <w:lvlJc w:val="left"/>
       <w:pPr>
-        <w:ind w:left="5760" w:hanging="480"/>
+        <w:ind w:left="5760" w:hanging="360"/>
       </w:pPr>
     </w:lvl>
     <w:lvl w:ilvl="8">
@@ -5624,7 +5586,7 @@
       <w:lvlText w:val=" "/>
       <w:lvlJc w:val="left"/>
       <w:pPr>
-        <w:ind w:left="6480" w:hanging="480"/>
+        <w:ind w:left="6480" w:hanging="360"/>
       </w:pPr>
     </w:lvl>
   </w:abstractNum>
@@ -5639,10 +5601,10 @@
   <w:docDefaults>
     <w:rPrDefault>
       <w:rPr>
-        <w:rFonts w:asciiTheme="minorHAnsi" w:cstheme="minorBidi" w:eastAsiaTheme="minorHAnsi" w:hAnsiTheme="minorHAnsi"/>
+        <w:rFonts w:asciiTheme="minorHAnsi" w:cstheme="minorBidi" w:eastAsiaTheme="minorEastAsia" w:hAnsiTheme="minorHAnsi"/>
         <w:sz w:val="24"/>
         <w:szCs w:val="24"/>
-        <w:lang w:bidi="ar-SA" w:eastAsia="en-US" w:val="en-US"/>
+        <w:lang w:bidi="ar-SA" w:eastAsia="zh-CN" w:val="en-US"/>
       </w:rPr>
     </w:rPrDefault>
     <w:pPrDefault>
@@ -5660,10 +5622,10 @@
     <w:name w:val="Body Text"/>
     <w:basedOn w:val="Normal"/>
     <w:link w:val="BodyTextChar"/>
+    <w:qFormat/>
     <w:pPr>
       <w:spacing w:after="180" w:before="180"/>
     </w:pPr>
-    <w:qFormat/>
   </w:style>
   <w:style w:customStyle="1" w:styleId="FirstParagraph" w:type="paragraph">
     <w:name w:val="First Paragraph"/>
@@ -5683,57 +5645,94 @@
     <w:name w:val="Title"/>
     <w:basedOn w:val="Normal"/>
     <w:next w:val="BodyText"/>
+    <w:link w:val="TitleChar"/>
+    <w:uiPriority w:val="10"/>
     <w:qFormat/>
+    <w:rsid w:val="00A10FD9"/>
     <w:pPr>
-      <w:keepNext/>
-      <w:keepLines/>
-      <w:spacing w:after="240" w:before="480"/>
+      <w:spacing w:after="80" w:line="240" w:lineRule="auto"/>
+      <w:contextualSpacing/>
       <w:jc w:val="center"/>
     </w:pPr>
     <w:rPr>
       <w:rFonts w:asciiTheme="majorHAnsi" w:cstheme="majorBidi" w:eastAsiaTheme="majorEastAsia" w:hAnsiTheme="majorHAnsi"/>
-      <w:b/>
-      <w:bCs/>
-      <w:color w:themeColor="accent1" w:themeShade="B5" w:val="345A8A"/>
-      <w:sz w:val="36"/>
-      <w:szCs w:val="36"/>
+      <w:sz w:val="56"/>
+      <w:szCs w:val="56"/>
+    </w:rPr>
+  </w:style>
+  <w:style w:customStyle="1" w:styleId="TitleChar" w:type="character">
+    <w:name w:val="Title Char"/>
+    <w:basedOn w:val="DefaultParagraphFont"/>
+    <w:link w:val="Title"/>
+    <w:uiPriority w:val="10"/>
+    <w:rsid w:val="00A10FD9"/>
+    <w:rPr>
+      <w:rFonts w:asciiTheme="majorHAnsi" w:cstheme="majorBidi" w:eastAsiaTheme="majorEastAsia" w:hAnsiTheme="majorHAnsi"/>
+      <w:sz w:val="56"/>
+      <w:szCs w:val="56"/>
     </w:rPr>
   </w:style>
   <w:style w:styleId="Subtitle" w:type="paragraph">
     <w:name w:val="Subtitle"/>
+    <w:basedOn w:val="Title"/>
+    <w:next w:val="BodyText"/>
+    <w:link w:val="SubtitleChar"/>
+    <w:uiPriority w:val="11"/>
+    <w:qFormat/>
+    <w:rsid w:val="00A10FD9"/>
+    <w:pPr>
+      <w:numPr>
+        <w:ilvl w:val="1"/>
+      </w:numPr>
+    </w:pPr>
+    <w:rPr>
+      <w:rFonts w:cstheme="majorBidi" w:eastAsiaTheme="majorEastAsia"/>
+      <w:spacing w:val="15"/>
+      <w:sz w:val="28"/>
+      <w:szCs w:val="28"/>
+    </w:rPr>
+  </w:style>
+  <w:style w:customStyle="1" w:styleId="SubtitleChar" w:type="character">
+    <w:name w:val="Subtitle Char"/>
+    <w:basedOn w:val="DefaultParagraphFont"/>
+    <w:link w:val="Subtitle"/>
+    <w:uiPriority w:val="11"/>
+    <w:rsid w:val="00A10FD9"/>
+    <w:rPr>
+      <w:rFonts w:cstheme="majorBidi" w:eastAsiaTheme="majorEastAsia"/>
+      <w:color w:themeColor="text1" w:themeTint="A6" w:val="595959"/>
+      <w:spacing w:val="15"/>
+      <w:sz w:val="28"/>
+      <w:szCs w:val="28"/>
+    </w:rPr>
+  </w:style>
+  <w:style w:customStyle="1" w:styleId="Author" w:type="paragraph">
+    <w:name w:val="Author"/>
     <w:basedOn w:val="Title"/>
     <w:next w:val="BodyText"/>
     <w:qFormat/>
     <w:pPr>
       <w:keepNext/>
       <w:keepLines/>
-      <w:spacing w:after="240" w:before="240"/>
-      <w:jc w:val="center"/>
     </w:pPr>
     <w:rPr>
-      <w:sz w:val="30"/>
-      <w:szCs w:val="30"/>
+      <w:sz w:val="24"/>
+      <w:szCs w:val="24"/>
     </w:rPr>
   </w:style>
-  <w:style w:customStyle="1" w:styleId="Author" w:type="paragraph">
-    <w:name w:val="Author"/>
+  <w:style w:styleId="Date" w:type="paragraph">
+    <w:name w:val="Date"/>
+    <w:basedOn w:val="Title"/>
     <w:next w:val="BodyText"/>
     <w:qFormat/>
     <w:pPr>
       <w:keepNext/>
       <w:keepLines/>
-      <w:jc w:val="center"/>
     </w:pPr>
-  </w:style>
-  <w:style w:styleId="Date" w:type="paragraph">
-    <w:name w:val="Date"/>
-    <w:next w:val="BodyText"/>
-    <w:qFormat/>
-    <w:pPr>
-      <w:keepNext/>
-      <w:keepLines/>
-      <w:jc w:val="center"/>
-    </w:pPr>
+    <w:rPr>
+      <w:sz w:val="24"/>
+      <w:szCs w:val="24"/>
+    </w:rPr>
   </w:style>
   <w:style w:customStyle="1" w:styleId="AbstractTitle" w:type="paragraph">
     <w:name w:val="Abstract Title"/>
@@ -5743,15 +5742,13 @@
     <w:pPr>
       <w:keepNext/>
       <w:keepLines/>
+      <w:spacing w:after="0" w:before="300"/>
       <w:jc w:val="center"/>
-      <w:spacing w:after="0" w:before="300"/>
     </w:pPr>
     <w:rPr>
+      <w:b/>
       <w:sz w:val="20"/>
       <w:szCs w:val="20"/>
-      <w:b/>
-      <w:color w:val="345A8A"/>
-      &gt;
     </w:rPr>
   </w:style>
   <w:style w:customStyle="1" w:styleId="Abstract" w:type="paragraph">
@@ -5778,191 +5775,321 @@
     <w:rPr/>
   </w:style>
   <w:style w:styleId="Heading1" w:type="paragraph">
-    <w:name w:val="Heading 1"/>
+    <w:name w:val="heading 1"/>
     <w:basedOn w:val="Normal"/>
     <w:next w:val="BodyText"/>
+    <w:link w:val="Heading1Char"/>
     <w:uiPriority w:val="9"/>
     <w:qFormat/>
+    <w:rsid w:val="00A10FD9"/>
     <w:pPr>
       <w:keepNext/>
       <w:keepLines/>
-      <w:spacing w:after="0" w:before="480"/>
+      <w:spacing w:after="80" w:before="360"/>
       <w:outlineLvl w:val="0"/>
     </w:pPr>
     <w:rPr>
       <w:rFonts w:asciiTheme="majorHAnsi" w:cstheme="majorBidi" w:eastAsiaTheme="majorEastAsia" w:hAnsiTheme="majorHAnsi"/>
-      <w:b/>
-      <w:bCs/>
-      <w:color w:themeColor="accent1" w:val="4F81BD"/>
-      <w:sz w:val="32"/>
-      <w:szCs w:val="32"/>
+      <w:color w:themeColor="accent1" w:themeShade="BF" w:val="0F4761"/>
+      <w:sz w:val="40"/>
+      <w:szCs w:val="40"/>
     </w:rPr>
   </w:style>
   <w:style w:styleId="Heading2" w:type="paragraph">
-    <w:name w:val="Heading 2"/>
+    <w:name w:val="heading 2"/>
     <w:basedOn w:val="Normal"/>
     <w:next w:val="BodyText"/>
+    <w:link w:val="Heading2Char"/>
     <w:uiPriority w:val="9"/>
+    <w:semiHidden/>
     <w:unhideWhenUsed/>
     <w:qFormat/>
+    <w:rsid w:val="00A10FD9"/>
     <w:pPr>
       <w:keepNext/>
       <w:keepLines/>
-      <w:spacing w:after="0" w:before="200"/>
+      <w:spacing w:after="80" w:before="160"/>
       <w:outlineLvl w:val="1"/>
     </w:pPr>
     <w:rPr>
       <w:rFonts w:asciiTheme="majorHAnsi" w:cstheme="majorBidi" w:eastAsiaTheme="majorEastAsia" w:hAnsiTheme="majorHAnsi"/>
-      <w:b/>
-      <w:bCs/>
-      <w:color w:themeColor="accent1" w:val="4F81BD"/>
+      <w:color w:themeColor="accent1" w:themeShade="BF" w:val="0F4761"/>
+      <w:sz w:val="32"/>
+      <w:szCs w:val="32"/>
+    </w:rPr>
+  </w:style>
+  <w:style w:styleId="Heading3" w:type="paragraph">
+    <w:name w:val="heading 3"/>
+    <w:basedOn w:val="Normal"/>
+    <w:next w:val="BodyText"/>
+    <w:link w:val="Heading3Char"/>
+    <w:uiPriority w:val="9"/>
+    <w:semiHidden/>
+    <w:unhideWhenUsed/>
+    <w:qFormat/>
+    <w:rsid w:val="00A10FD9"/>
+    <w:pPr>
+      <w:keepNext/>
+      <w:keepLines/>
+      <w:spacing w:after="80" w:before="160"/>
+      <w:outlineLvl w:val="2"/>
+    </w:pPr>
+    <w:rPr>
+      <w:rFonts w:cstheme="majorBidi" w:eastAsiaTheme="majorEastAsia"/>
+      <w:color w:themeColor="accent1" w:themeShade="BF" w:val="0F4761"/>
       <w:sz w:val="28"/>
       <w:szCs w:val="28"/>
     </w:rPr>
   </w:style>
-  <w:style w:styleId="Heading3" w:type="paragraph">
-    <w:name w:val="Heading 3"/>
+  <w:style w:styleId="Heading4" w:type="paragraph">
+    <w:name w:val="heading 4"/>
     <w:basedOn w:val="Normal"/>
     <w:next w:val="BodyText"/>
+    <w:link w:val="Heading4Char"/>
     <w:uiPriority w:val="9"/>
+    <w:semiHidden/>
     <w:unhideWhenUsed/>
     <w:qFormat/>
+    <w:rsid w:val="00A10FD9"/>
     <w:pPr>
       <w:keepNext/>
       <w:keepLines/>
-      <w:spacing w:after="0" w:before="200"/>
-      <w:outlineLvl w:val="2"/>
+      <w:spacing w:after="40" w:before="80"/>
+      <w:outlineLvl w:val="3"/>
     </w:pPr>
     <w:rPr>
-      <w:rFonts w:asciiTheme="majorHAnsi" w:cstheme="majorBidi" w:eastAsiaTheme="majorEastAsia" w:hAnsiTheme="majorHAnsi"/>
-      <w:b/>
-      <w:bCs/>
-      <w:color w:themeColor="accent1" w:val="4F81BD"/>
-      <w:sz w:val="24"/>
-      <w:szCs w:val="24"/>
+      <w:rFonts w:cstheme="majorBidi" w:eastAsiaTheme="majorEastAsia"/>
+      <w:i/>
+      <w:iCs/>
+      <w:color w:themeColor="accent1" w:themeShade="BF" w:val="0F4761"/>
     </w:rPr>
   </w:style>
-  <w:style w:styleId="Heading4" w:type="paragraph">
-    <w:name w:val="Heading 4"/>
+  <w:style w:styleId="Heading5" w:type="paragraph">
+    <w:name w:val="heading 5"/>
     <w:basedOn w:val="Normal"/>
     <w:next w:val="BodyText"/>
+    <w:link w:val="Heading5Char"/>
     <w:uiPriority w:val="9"/>
+    <w:semiHidden/>
     <w:unhideWhenUsed/>
     <w:qFormat/>
+    <w:rsid w:val="00A10FD9"/>
     <w:pPr>
       <w:keepNext/>
       <w:keepLines/>
-      <w:spacing w:after="0" w:before="200"/>
-      <w:outlineLvl w:val="3"/>
+      <w:spacing w:after="40" w:before="80"/>
+      <w:outlineLvl w:val="4"/>
     </w:pPr>
     <w:rPr>
-      <w:rFonts w:asciiTheme="majorHAnsi" w:cstheme="majorBidi" w:eastAsiaTheme="majorEastAsia" w:hAnsiTheme="majorHAnsi"/>
-      <w:i/>
-      <w:bCs/>
-      <w:color w:themeColor="accent1" w:val="4F81BD"/>
-      <w:sz w:val="24"/>
-      <w:szCs w:val="24"/>
+      <w:rFonts w:cstheme="majorBidi" w:eastAsiaTheme="majorEastAsia"/>
+      <w:color w:themeColor="accent1" w:themeShade="BF" w:val="0F4761"/>
     </w:rPr>
   </w:style>
-  <w:style w:styleId="Heading5" w:type="paragraph">
-    <w:name w:val="Heading 5"/>
+  <w:style w:styleId="Heading6" w:type="paragraph">
+    <w:name w:val="heading 6"/>
     <w:basedOn w:val="Normal"/>
     <w:next w:val="BodyText"/>
+    <w:link w:val="Heading6Char"/>
     <w:uiPriority w:val="9"/>
+    <w:semiHidden/>
     <w:unhideWhenUsed/>
     <w:qFormat/>
+    <w:rsid w:val="00A10FD9"/>
     <w:pPr>
       <w:keepNext/>
       <w:keepLines/>
-      <w:spacing w:after="0" w:before="200"/>
-      <w:outlineLvl w:val="4"/>
+      <w:spacing w:after="0" w:before="40"/>
+      <w:outlineLvl w:val="5"/>
     </w:pPr>
     <w:rPr>
-      <w:rFonts w:asciiTheme="majorHAnsi" w:cstheme="majorBidi" w:eastAsiaTheme="majorEastAsia" w:hAnsiTheme="majorHAnsi"/>
+      <w:rFonts w:cstheme="majorBidi" w:eastAsiaTheme="majorEastAsia"/>
+      <w:i/>
       <w:iCs/>
-      <w:color w:themeColor="accent1" w:val="4F81BD"/>
-      <w:sz w:val="24"/>
-      <w:szCs w:val="24"/>
+      <w:color w:themeColor="text1" w:themeTint="A6" w:val="595959"/>
     </w:rPr>
   </w:style>
-  <w:style w:styleId="Heading6" w:type="paragraph">
-    <w:name w:val="Heading 6"/>
+  <w:style w:styleId="Heading7" w:type="paragraph">
+    <w:name w:val="heading 7"/>
     <w:basedOn w:val="Normal"/>
     <w:next w:val="BodyText"/>
+    <w:link w:val="Heading7Char"/>
     <w:uiPriority w:val="9"/>
+    <w:semiHidden/>
     <w:unhideWhenUsed/>
     <w:qFormat/>
+    <w:rsid w:val="00A10FD9"/>
     <w:pPr>
       <w:keepNext/>
       <w:keepLines/>
-      <w:spacing w:after="0" w:before="200"/>
-      <w:outlineLvl w:val="5"/>
+      <w:spacing w:after="0" w:before="40"/>
+      <w:outlineLvl w:val="6"/>
     </w:pPr>
     <w:rPr>
-      <w:rFonts w:asciiTheme="majorHAnsi" w:cstheme="majorBidi" w:eastAsiaTheme="majorEastAsia" w:hAnsiTheme="majorHAnsi"/>
-      <w:color w:themeColor="accent1" w:val="4F81BD"/>
-      <w:sz w:val="24"/>
-      <w:szCs w:val="24"/>
+      <w:rFonts w:cstheme="majorBidi" w:eastAsiaTheme="majorEastAsia"/>
+      <w:color w:themeColor="text1" w:themeTint="A6" w:val="595959"/>
     </w:rPr>
   </w:style>
-  <w:style w:styleId="Heading7" w:type="paragraph">
-    <w:name w:val="Heading 7"/>
+  <w:style w:styleId="Heading8" w:type="paragraph">
+    <w:name w:val="heading 8"/>
     <w:basedOn w:val="Normal"/>
     <w:next w:val="BodyText"/>
+    <w:link w:val="Heading8Char"/>
     <w:uiPriority w:val="9"/>
+    <w:semiHidden/>
     <w:unhideWhenUsed/>
     <w:qFormat/>
+    <w:rsid w:val="00A10FD9"/>
     <w:pPr>
       <w:keepNext/>
       <w:keepLines/>
-      <w:spacing w:after="0" w:before="200"/>
-      <w:outlineLvl w:val="6"/>
+      <w:spacing w:after="0"/>
+      <w:outlineLvl w:val="7"/>
     </w:pPr>
     <w:rPr>
-      <w:rFonts w:asciiTheme="majorHAnsi" w:cstheme="majorBidi" w:eastAsiaTheme="majorEastAsia" w:hAnsiTheme="majorHAnsi"/>
-      <w:color w:themeColor="accent1" w:val="4F81BD"/>
-      <w:sz w:val="24"/>
-      <w:szCs w:val="24"/>
+      <w:rFonts w:cstheme="majorBidi" w:eastAsiaTheme="majorEastAsia"/>
+      <w:i/>
+      <w:iCs/>
+      <w:color w:themeColor="text1" w:themeTint="D8" w:val="272727"/>
     </w:rPr>
   </w:style>
-  <w:style w:styleId="Heading8" w:type="paragraph">
-    <w:name w:val="Heading 8"/>
+  <w:style w:styleId="Heading9" w:type="paragraph">
+    <w:name w:val="heading 9"/>
     <w:basedOn w:val="Normal"/>
     <w:next w:val="BodyText"/>
+    <w:link w:val="Heading9Char"/>
     <w:uiPriority w:val="9"/>
+    <w:semiHidden/>
     <w:unhideWhenUsed/>
     <w:qFormat/>
+    <w:rsid w:val="00A10FD9"/>
     <w:pPr>
       <w:keepNext/>
       <w:keepLines/>
-      <w:spacing w:after="0" w:before="200"/>
-      <w:outlineLvl w:val="7"/>
-    </w:pPr>
-    <w:rPr>
-      <w:rFonts w:asciiTheme="majorHAnsi" w:cstheme="majorBidi" w:eastAsiaTheme="majorEastAsia" w:hAnsiTheme="majorHAnsi"/>
-      <w:color w:themeColor="accent1" w:val="4F81BD"/>
-      <w:sz w:val="24"/>
-      <w:szCs w:val="24"/>
-    </w:rPr>
-  </w:style>
-  <w:style w:styleId="Heading9" w:type="paragraph">
-    <w:name w:val="Heading 9"/>
-    <w:basedOn w:val="Normal"/>
-    <w:next w:val="BodyText"/>
-    <w:uiPriority w:val="9"/>
-    <w:unhideWhenUsed/>
-    <w:qFormat/>
-    <w:pPr>
-      <w:keepNext/>
-      <w:keepLines/>
-      <w:spacing w:after="0" w:before="200"/>
+      <w:spacing w:after="0"/>
       <w:outlineLvl w:val="8"/>
     </w:pPr>
     <w:rPr>
+      <w:rFonts w:cstheme="majorBidi" w:eastAsiaTheme="majorEastAsia"/>
+      <w:color w:themeColor="text1" w:themeTint="D8" w:val="272727"/>
+    </w:rPr>
+  </w:style>
+  <w:style w:customStyle="1" w:styleId="Heading1Char" w:type="character">
+    <w:name w:val="Heading 1 Char"/>
+    <w:basedOn w:val="DefaultParagraphFont"/>
+    <w:link w:val="Heading1"/>
+    <w:uiPriority w:val="9"/>
+    <w:rsid w:val="00A10FD9"/>
+    <w:rPr>
       <w:rFonts w:asciiTheme="majorHAnsi" w:cstheme="majorBidi" w:eastAsiaTheme="majorEastAsia" w:hAnsiTheme="majorHAnsi"/>
-      <w:color w:themeColor="accent1" w:val="4F81BD"/>
-      <w:sz w:val="24"/>
-      <w:szCs w:val="24"/>
+      <w:color w:themeColor="accent1" w:themeShade="BF" w:val="0F4761"/>
+      <w:sz w:val="40"/>
+      <w:szCs w:val="40"/>
+    </w:rPr>
+  </w:style>
+  <w:style w:customStyle="1" w:styleId="Heading2Char" w:type="character">
+    <w:name w:val="Heading 2 Char"/>
+    <w:basedOn w:val="DefaultParagraphFont"/>
+    <w:link w:val="Heading2"/>
+    <w:uiPriority w:val="9"/>
+    <w:semiHidden/>
+    <w:rsid w:val="00A10FD9"/>
+    <w:rPr>
+      <w:rFonts w:asciiTheme="majorHAnsi" w:cstheme="majorBidi" w:eastAsiaTheme="majorEastAsia" w:hAnsiTheme="majorHAnsi"/>
+      <w:color w:themeColor="accent1" w:themeShade="BF" w:val="0F4761"/>
+      <w:sz w:val="32"/>
+      <w:szCs w:val="32"/>
+    </w:rPr>
+  </w:style>
+  <w:style w:customStyle="1" w:styleId="Heading3Char" w:type="character">
+    <w:name w:val="Heading 3 Char"/>
+    <w:basedOn w:val="DefaultParagraphFont"/>
+    <w:link w:val="Heading3"/>
+    <w:uiPriority w:val="9"/>
+    <w:semiHidden/>
+    <w:rsid w:val="00A10FD9"/>
+    <w:rPr>
+      <w:rFonts w:cstheme="majorBidi" w:eastAsiaTheme="majorEastAsia"/>
+      <w:color w:themeColor="accent1" w:themeShade="BF" w:val="0F4761"/>
+      <w:sz w:val="28"/>
+      <w:szCs w:val="28"/>
+    </w:rPr>
+  </w:style>
+  <w:style w:customStyle="1" w:styleId="Heading4Char" w:type="character">
+    <w:name w:val="Heading 4 Char"/>
+    <w:basedOn w:val="DefaultParagraphFont"/>
+    <w:link w:val="Heading4"/>
+    <w:uiPriority w:val="9"/>
+    <w:semiHidden/>
+    <w:rsid w:val="00A10FD9"/>
+    <w:rPr>
+      <w:rFonts w:cstheme="majorBidi" w:eastAsiaTheme="majorEastAsia"/>
+      <w:i/>
+      <w:iCs/>
+      <w:color w:themeColor="accent1" w:themeShade="BF" w:val="0F4761"/>
+    </w:rPr>
+  </w:style>
+  <w:style w:customStyle="1" w:styleId="Heading5Char" w:type="character">
+    <w:name w:val="Heading 5 Char"/>
+    <w:basedOn w:val="DefaultParagraphFont"/>
+    <w:link w:val="Heading5"/>
+    <w:uiPriority w:val="9"/>
+    <w:semiHidden/>
+    <w:rsid w:val="00A10FD9"/>
+    <w:rPr>
+      <w:rFonts w:cstheme="majorBidi" w:eastAsiaTheme="majorEastAsia"/>
+      <w:color w:themeColor="accent1" w:themeShade="BF" w:val="0F4761"/>
+    </w:rPr>
+  </w:style>
+  <w:style w:customStyle="1" w:styleId="Heading6Char" w:type="character">
+    <w:name w:val="Heading 6 Char"/>
+    <w:basedOn w:val="DefaultParagraphFont"/>
+    <w:link w:val="Heading6"/>
+    <w:uiPriority w:val="9"/>
+    <w:semiHidden/>
+    <w:rsid w:val="00A10FD9"/>
+    <w:rPr>
+      <w:rFonts w:cstheme="majorBidi" w:eastAsiaTheme="majorEastAsia"/>
+      <w:i/>
+      <w:iCs/>
+      <w:color w:themeColor="text1" w:themeTint="A6" w:val="595959"/>
+    </w:rPr>
+  </w:style>
+  <w:style w:customStyle="1" w:styleId="Heading7Char" w:type="character">
+    <w:name w:val="Heading 7 Char"/>
+    <w:basedOn w:val="DefaultParagraphFont"/>
+    <w:link w:val="Heading7"/>
+    <w:uiPriority w:val="9"/>
+    <w:semiHidden/>
+    <w:rsid w:val="00A10FD9"/>
+    <w:rPr>
+      <w:rFonts w:cstheme="majorBidi" w:eastAsiaTheme="majorEastAsia"/>
+      <w:color w:themeColor="text1" w:themeTint="A6" w:val="595959"/>
+    </w:rPr>
+  </w:style>
+  <w:style w:customStyle="1" w:styleId="Heading8Char" w:type="character">
+    <w:name w:val="Heading 8 Char"/>
+    <w:basedOn w:val="DefaultParagraphFont"/>
+    <w:link w:val="Heading8"/>
+    <w:uiPriority w:val="9"/>
+    <w:semiHidden/>
+    <w:rsid w:val="00A10FD9"/>
+    <w:rPr>
+      <w:rFonts w:cstheme="majorBidi" w:eastAsiaTheme="majorEastAsia"/>
+      <w:i/>
+      <w:iCs/>
+      <w:color w:themeColor="text1" w:themeTint="D8" w:val="272727"/>
+    </w:rPr>
+  </w:style>
+  <w:style w:customStyle="1" w:styleId="Heading9Char" w:type="character">
+    <w:name w:val="Heading 9 Char"/>
+    <w:basedOn w:val="DefaultParagraphFont"/>
+    <w:link w:val="Heading9"/>
+    <w:uiPriority w:val="9"/>
+    <w:semiHidden/>
+    <w:rsid w:val="00A10FD9"/>
+    <w:rPr>
+      <w:rFonts w:cstheme="majorBidi" w:eastAsiaTheme="majorEastAsia"/>
+      <w:color w:themeColor="text1" w:themeTint="D8" w:val="272727"/>
     </w:rPr>
   </w:style>
   <w:style w:styleId="BlockText" w:type="paragraph">
@@ -5984,6 +6111,18 @@
     <w:uiPriority w:val="9"/>
     <w:unhideWhenUsed/>
     <w:qFormat/>
+  </w:style>
+  <w:style w:styleId="FootnoteBlockText" w:type="paragraph">
+    <w:name w:val="Footnote Block Text"/>
+    <w:basedOn w:val="FootnoteText"/>
+    <w:next w:val="FootnoteText"/>
+    <w:uiPriority w:val="9"/>
+    <w:unhideWhenUsed/>
+    <w:qFormat/>
+    <w:pPr>
+      <w:spacing w:after="100" w:before="100"/>
+      <w:ind w:firstLine="0" w:left="480" w:right="480"/>
+    </w:pPr>
   </w:style>
   <w:style w:default="1" w:styleId="DefaultParagraphFont" w:type="character">
     <w:name w:val="Default Paragraph Font"/>
@@ -6006,18 +6145,11 @@
       </w:tblCellMar>
     </w:tblPr>
     <w:tblStylePr w:type="firstRow">
-      <w:tblPr>
-        <w:jc w:val="left"/>
-        <w:tblInd w:type="dxa" w:w="0"/>
-      </w:tblPr>
-      <w:trPr>
-        <w:jc w:val="left"/>
-      </w:trPr>
       <w:tcPr>
-        <w:vAlign w:val="bottom"/>
         <w:tcBorders>
           <w:bottom w:val="single"/>
         </w:tcBorders>
+        <w:vAlign w:val="bottom"/>
       </w:tcPr>
     </w:tblStylePr>
   </w:style>
@@ -6132,8 +6264,8 @@
     <w:name w:val="KeywordTok"/>
     <w:basedOn w:val="VerbatimChar"/>
     <w:rPr>
+      <w:b/>
       <w:color w:val="007020"/>
-      <w:b/>
     </w:rPr>
   </w:style>
   <w:style w:type="character" w:customStyle="1" w:styleId="DataTypeTok">
@@ -6210,42 +6342,42 @@
     <w:name w:val="ImportTok"/>
     <w:basedOn w:val="VerbatimChar"/>
     <w:rPr>
+      <w:b/>
       <w:color w:val="008000"/>
-      <w:b/>
     </w:rPr>
   </w:style>
   <w:style w:type="character" w:customStyle="1" w:styleId="CommentTok">
     <w:name w:val="CommentTok"/>
     <w:basedOn w:val="VerbatimChar"/>
     <w:rPr>
+      <w:i/>
       <w:color w:val="60a0b0"/>
-      <w:i/>
     </w:rPr>
   </w:style>
   <w:style w:type="character" w:customStyle="1" w:styleId="DocumentationTok">
     <w:name w:val="DocumentationTok"/>
     <w:basedOn w:val="VerbatimChar"/>
     <w:rPr>
+      <w:i/>
       <w:color w:val="ba2121"/>
-      <w:i/>
     </w:rPr>
   </w:style>
   <w:style w:type="character" w:customStyle="1" w:styleId="AnnotationTok">
     <w:name w:val="AnnotationTok"/>
     <w:basedOn w:val="VerbatimChar"/>
     <w:rPr>
-      <w:color w:val="60a0b0"/>
       <w:b/>
       <w:i/>
+      <w:color w:val="60a0b0"/>
     </w:rPr>
   </w:style>
   <w:style w:type="character" w:customStyle="1" w:styleId="CommentVarTok">
     <w:name w:val="CommentVarTok"/>
     <w:basedOn w:val="VerbatimChar"/>
     <w:rPr>
-      <w:color w:val="60a0b0"/>
       <w:b/>
       <w:i/>
+      <w:color w:val="60a0b0"/>
     </w:rPr>
   </w:style>
   <w:style w:type="character" w:customStyle="1" w:styleId="OtherTok">
@@ -6273,8 +6405,8 @@
     <w:name w:val="ControlFlowTok"/>
     <w:basedOn w:val="VerbatimChar"/>
     <w:rPr>
+      <w:b/>
       <w:color w:val="007020"/>
-      <w:b/>
     </w:rPr>
   </w:style>
   <w:style w:type="character" w:customStyle="1" w:styleId="OperatorTok">
@@ -6319,34 +6451,34 @@
     <w:name w:val="InformationTok"/>
     <w:basedOn w:val="VerbatimChar"/>
     <w:rPr>
-      <w:color w:val="60a0b0"/>
       <w:b/>
       <w:i/>
+      <w:color w:val="60a0b0"/>
     </w:rPr>
   </w:style>
   <w:style w:type="character" w:customStyle="1" w:styleId="WarningTok">
     <w:name w:val="WarningTok"/>
     <w:basedOn w:val="VerbatimChar"/>
     <w:rPr>
-      <w:color w:val="60a0b0"/>
       <w:b/>
       <w:i/>
+      <w:color w:val="60a0b0"/>
     </w:rPr>
   </w:style>
   <w:style w:type="character" w:customStyle="1" w:styleId="AlertTok">
     <w:name w:val="AlertTok"/>
     <w:basedOn w:val="VerbatimChar"/>
     <w:rPr>
+      <w:b/>
       <w:color w:val="ff0000"/>
-      <w:b/>
     </w:rPr>
   </w:style>
   <w:style w:type="character" w:customStyle="1" w:styleId="ErrorTok">
     <w:name w:val="ErrorTok"/>
     <w:basedOn w:val="VerbatimChar"/>
     <w:rPr>
+      <w:b/>
       <w:color w:val="ff0000"/>
-      <w:b/>
     </w:rPr>
   </w:style>
   <w:style w:type="character" w:customStyle="1" w:styleId="NormalTok">
@@ -6368,44 +6500,44 @@
         <a:sysClr val="window" lastClr="FFFFFF"/>
       </a:lt1>
       <a:dk2>
-        <a:srgbClr val="1F497D"/>
+        <a:srgbClr val="0E2841"/>
       </a:dk2>
       <a:lt2>
-        <a:srgbClr val="EEECE1"/>
+        <a:srgbClr val="E8E8E8"/>
       </a:lt2>
       <a:accent1>
-        <a:srgbClr val="4F81BD"/>
+        <a:srgbClr val="156082"/>
       </a:accent1>
       <a:accent2>
-        <a:srgbClr val="C0504D"/>
+        <a:srgbClr val="E97132"/>
       </a:accent2>
       <a:accent3>
-        <a:srgbClr val="9BBB59"/>
+        <a:srgbClr val="196B24"/>
       </a:accent3>
       <a:accent4>
-        <a:srgbClr val="8064A2"/>
+        <a:srgbClr val="0F9ED5"/>
       </a:accent4>
       <a:accent5>
-        <a:srgbClr val="4BACC6"/>
+        <a:srgbClr val="A02B93"/>
       </a:accent5>
       <a:accent6>
-        <a:srgbClr val="F79646"/>
+        <a:srgbClr val="4EA72E"/>
       </a:accent6>
       <a:hlink>
-        <a:srgbClr val="0000FF"/>
+        <a:srgbClr val="467886"/>
       </a:hlink>
       <a:folHlink>
-        <a:srgbClr val="800080"/>
+        <a:srgbClr val="96607D"/>
       </a:folHlink>
     </a:clrScheme>
     <a:fontScheme name="Office">
       <a:majorFont>
-        <a:latin typeface="Calibri"/>
+        <a:latin typeface="Aptos Display" panose="02110004020202020204"/>
         <a:ea typeface=""/>
         <a:cs typeface=""/>
-        <a:font script="Jpan" typeface="ＭＳ ゴシック"/>
+        <a:font script="Jpan" typeface="游ゴシック Light"/>
         <a:font script="Hang" typeface="맑은 고딕"/>
-        <a:font script="Hans" typeface="宋体"/>
+        <a:font script="Hans" typeface="等线 Light"/>
         <a:font script="Hant" typeface="新細明體"/>
         <a:font script="Arab" typeface="Times New Roman"/>
         <a:font script="Hebr" typeface="Times New Roman"/>
@@ -6432,14 +6564,32 @@
         <a:font script="Mong" typeface="Mongolian Baiti"/>
         <a:font script="Viet" typeface="Times New Roman"/>
         <a:font script="Uigh" typeface="Microsoft Uighur"/>
+        <a:font script="Geor" typeface="Sylfaen"/>
+        <a:font script="Armn" typeface="Arial"/>
+        <a:font script="Bugi" typeface="Leelawadee UI"/>
+        <a:font script="Bopo" typeface="Microsoft JhengHei"/>
+        <a:font script="Java" typeface="Javanese Text"/>
+        <a:font script="Lisu" typeface="Segoe UI"/>
+        <a:font script="Mymr" typeface="Myanmar Text"/>
+        <a:font script="Nkoo" typeface="Ebrima"/>
+        <a:font script="Olck" typeface="Nirmala UI"/>
+        <a:font script="Osma" typeface="Ebrima"/>
+        <a:font script="Phag" typeface="Phagspa"/>
+        <a:font script="Syrn" typeface="Estrangelo Edessa"/>
+        <a:font script="Syrj" typeface="Estrangelo Edessa"/>
+        <a:font script="Syre" typeface="Estrangelo Edessa"/>
+        <a:font script="Sora" typeface="Nirmala UI"/>
+        <a:font script="Tale" typeface="Microsoft Tai Le"/>
+        <a:font script="Talu" typeface="Microsoft New Tai Lue"/>
+        <a:font script="Tfng" typeface="Ebrima"/>
       </a:majorFont>
       <a:minorFont>
-        <a:latin typeface="Cambria"/>
+        <a:latin typeface="Aptos" panose="02110004020202020204"/>
         <a:ea typeface=""/>
         <a:cs typeface=""/>
-        <a:font script="Jpan" typeface="ＭＳ 明朝"/>
+        <a:font script="Jpan" typeface="游明朝"/>
         <a:font script="Hang" typeface="맑은 고딕"/>
-        <a:font script="Hans" typeface="宋体"/>
+        <a:font script="Hans" typeface="等线"/>
         <a:font script="Hant" typeface="新細明體"/>
         <a:font script="Arab" typeface="Arial"/>
         <a:font script="Hebr" typeface="Arial"/>
@@ -6466,6 +6616,24 @@
         <a:font script="Mong" typeface="Mongolian Baiti"/>
         <a:font script="Viet" typeface="Arial"/>
         <a:font script="Uigh" typeface="Microsoft Uighur"/>
+        <a:font script="Geor" typeface="Sylfaen"/>
+        <a:font script="Armn" typeface="Arial"/>
+        <a:font script="Bugi" typeface="Leelawadee UI"/>
+        <a:font script="Bopo" typeface="Microsoft JhengHei"/>
+        <a:font script="Java" typeface="Javanese Text"/>
+        <a:font script="Lisu" typeface="Segoe UI"/>
+        <a:font script="Mymr" typeface="Myanmar Text"/>
+        <a:font script="Nkoo" typeface="Ebrima"/>
+        <a:font script="Olck" typeface="Nirmala UI"/>
+        <a:font script="Osma" typeface="Ebrima"/>
+        <a:font script="Phag" typeface="Phagspa"/>
+        <a:font script="Syrn" typeface="Estrangelo Edessa"/>
+        <a:font script="Syrj" typeface="Estrangelo Edessa"/>
+        <a:font script="Syre" typeface="Estrangelo Edessa"/>
+        <a:font script="Sora" typeface="Nirmala UI"/>
+        <a:font script="Tale" typeface="Microsoft Tai Le"/>
+        <a:font script="Talu" typeface="Microsoft New Tai Lue"/>
+        <a:font script="Tfng" typeface="Ebrima"/>
       </a:minorFont>
     </a:fontScheme>
     <a:fmtScheme name="Office">
@@ -6477,200 +6645,141 @@
           <a:gsLst>
             <a:gs pos="0">
               <a:schemeClr val="phClr">
-                <a:tint val="50000"/>
-                <a:satMod val="300000"/>
+                <a:lumMod val="110000"/>
+                <a:satMod val="105000"/>
+                <a:tint val="67000"/>
               </a:schemeClr>
             </a:gs>
-            <a:gs pos="35000">
+            <a:gs pos="50000">
               <a:schemeClr val="phClr">
-                <a:tint val="37000"/>
-                <a:satMod val="300000"/>
+                <a:lumMod val="105000"/>
+                <a:satMod val="103000"/>
+                <a:tint val="73000"/>
               </a:schemeClr>
             </a:gs>
             <a:gs pos="100000">
               <a:schemeClr val="phClr">
-                <a:tint val="15000"/>
-                <a:satMod val="350000"/>
+                <a:lumMod val="105000"/>
+                <a:satMod val="109000"/>
+                <a:tint val="81000"/>
               </a:schemeClr>
             </a:gs>
           </a:gsLst>
-          <a:lin ang="16200000" scaled="1"/>
+          <a:lin ang="5400000" scaled="0"/>
         </a:gradFill>
         <a:gradFill rotWithShape="1">
           <a:gsLst>
             <a:gs pos="0">
               <a:schemeClr val="phClr">
-                <a:tint val="100000"/>
+                <a:satMod val="103000"/>
+                <a:lumMod val="102000"/>
+                <a:tint val="94000"/>
+              </a:schemeClr>
+            </a:gs>
+            <a:gs pos="50000">
+              <a:schemeClr val="phClr">
+                <a:satMod val="110000"/>
+                <a:lumMod val="100000"/>
                 <a:shade val="100000"/>
-                <a:satMod val="130000"/>
               </a:schemeClr>
             </a:gs>
             <a:gs pos="100000">
               <a:schemeClr val="phClr">
-                <a:tint val="50000"/>
-                <a:shade val="100000"/>
-                <a:satMod val="350000"/>
+                <a:lumMod val="99000"/>
+                <a:satMod val="120000"/>
+                <a:shade val="78000"/>
               </a:schemeClr>
             </a:gs>
           </a:gsLst>
-          <a:lin ang="16200000" scaled="0"/>
+          <a:lin ang="5400000" scaled="0"/>
         </a:gradFill>
       </a:fillStyleLst>
       <a:lnStyleLst>
-        <a:ln w="9525" cap="flat" cmpd="sng" algn="ctr">
-          <a:solidFill>
-            <a:schemeClr val="phClr">
-              <a:shade val="95000"/>
-              <a:satMod val="105000"/>
-            </a:schemeClr>
-          </a:solidFill>
-          <a:prstDash val="solid"/>
-        </a:ln>
-        <a:ln w="25400" cap="flat" cmpd="sng" algn="ctr">
+        <a:ln w="6350" cap="flat" cmpd="sng" algn="ctr">
           <a:solidFill>
             <a:schemeClr val="phClr"/>
           </a:solidFill>
           <a:prstDash val="solid"/>
+          <a:miter lim="800000"/>
         </a:ln>
-        <a:ln w="38100" cap="flat" cmpd="sng" algn="ctr">
+        <a:ln w="12700" cap="flat" cmpd="sng" algn="ctr">
           <a:solidFill>
             <a:schemeClr val="phClr"/>
           </a:solidFill>
           <a:prstDash val="solid"/>
+          <a:miter lim="800000"/>
+        </a:ln>
+        <a:ln w="19050" cap="flat" cmpd="sng" algn="ctr">
+          <a:solidFill>
+            <a:schemeClr val="phClr"/>
+          </a:solidFill>
+          <a:prstDash val="solid"/>
+          <a:miter lim="800000"/>
         </a:ln>
       </a:lnStyleLst>
       <a:effectStyleLst>
         <a:effectStyle>
+          <a:effectLst/>
+        </a:effectStyle>
+        <a:effectStyle>
+          <a:effectLst/>
+        </a:effectStyle>
+        <a:effectStyle>
           <a:effectLst>
-            <a:outerShdw blurRad="40000" dist="20000" dir="5400000" rotWithShape="0">
+            <a:outerShdw blurRad="57150" dist="19050" dir="5400000" algn="ctr" rotWithShape="0">
               <a:srgbClr val="000000">
-                <a:alpha val="38000"/>
+                <a:alpha val="63000"/>
               </a:srgbClr>
             </a:outerShdw>
           </a:effectLst>
-        </a:effectStyle>
-        <a:effectStyle>
-          <a:effectLst>
-            <a:outerShdw blurRad="40000" dist="23000" dir="5400000" rotWithShape="0">
-              <a:srgbClr val="000000">
-                <a:alpha val="35000"/>
-              </a:srgbClr>
-            </a:outerShdw>
-          </a:effectLst>
-        </a:effectStyle>
-        <a:effectStyle>
-          <a:effectLst>
-            <a:outerShdw blurRad="40000" dist="23000" dir="5400000" rotWithShape="0">
-              <a:srgbClr val="000000">
-                <a:alpha val="35000"/>
-              </a:srgbClr>
-            </a:outerShdw>
-          </a:effectLst>
-          <a:scene3d>
-            <a:camera prst="orthographicFront">
-              <a:rot lat="0" lon="0" rev="0"/>
-            </a:camera>
-            <a:lightRig rig="threePt" dir="t">
-              <a:rot lat="0" lon="0" rev="1200000"/>
-            </a:lightRig>
-          </a:scene3d>
-          <a:sp3d>
-            <a:bevelT w="63500" h="25400"/>
-          </a:sp3d>
         </a:effectStyle>
       </a:effectStyleLst>
       <a:bgFillStyleLst>
         <a:solidFill>
           <a:schemeClr val="phClr"/>
         </a:solidFill>
+        <a:solidFill>
+          <a:schemeClr val="phClr">
+            <a:tint val="95000"/>
+            <a:satMod val="170000"/>
+          </a:schemeClr>
+        </a:solidFill>
         <a:gradFill rotWithShape="1">
           <a:gsLst>
             <a:gs pos="0">
               <a:schemeClr val="phClr">
-                <a:tint val="40000"/>
-                <a:satMod val="350000"/>
+                <a:tint val="93000"/>
+                <a:satMod val="150000"/>
+                <a:shade val="98000"/>
+                <a:lumMod val="102000"/>
               </a:schemeClr>
             </a:gs>
-            <a:gs pos="40000">
+            <a:gs pos="50000">
               <a:schemeClr val="phClr">
-                <a:tint val="45000"/>
-                <a:shade val="99000"/>
-                <a:satMod val="350000"/>
+                <a:tint val="98000"/>
+                <a:satMod val="130000"/>
+                <a:shade val="90000"/>
+                <a:lumMod val="103000"/>
               </a:schemeClr>
             </a:gs>
             <a:gs pos="100000">
               <a:schemeClr val="phClr">
-                <a:shade val="20000"/>
-                <a:satMod val="255000"/>
+                <a:shade val="63000"/>
+                <a:satMod val="120000"/>
               </a:schemeClr>
             </a:gs>
           </a:gsLst>
-          <a:path path="circle">
-            <a:fillToRect l="50000" t="-80000" r="50000" b="180000"/>
-          </a:path>
-        </a:gradFill>
-        <a:gradFill rotWithShape="1">
-          <a:gsLst>
-            <a:gs pos="0">
-              <a:schemeClr val="phClr">
-                <a:tint val="80000"/>
-                <a:satMod val="300000"/>
-              </a:schemeClr>
-            </a:gs>
-            <a:gs pos="100000">
-              <a:schemeClr val="phClr">
-                <a:shade val="30000"/>
-                <a:satMod val="200000"/>
-              </a:schemeClr>
-            </a:gs>
-          </a:gsLst>
-          <a:path path="circle">
-            <a:fillToRect l="50000" t="50000" r="50000" b="50000"/>
-          </a:path>
+          <a:lin ang="5400000" scaled="0"/>
         </a:gradFill>
       </a:bgFillStyleLst>
     </a:fmtScheme>
   </a:themeElements>
-  <a:objectDefaults>
-    <a:spDef>
-      <a:spPr/>
-      <a:bodyPr/>
-      <a:lstStyle/>
-      <a:style>
-        <a:lnRef idx="1">
-          <a:schemeClr val="accent1"/>
-        </a:lnRef>
-        <a:fillRef idx="3">
-          <a:schemeClr val="accent1"/>
-        </a:fillRef>
-        <a:effectRef idx="2">
-          <a:schemeClr val="accent1"/>
-        </a:effectRef>
-        <a:fontRef idx="minor">
-          <a:schemeClr val="lt1"/>
-        </a:fontRef>
-      </a:style>
-    </a:spDef>
-    <a:lnDef>
-      <a:spPr/>
-      <a:bodyPr/>
-      <a:lstStyle/>
-      <a:style>
-        <a:lnRef idx="2">
-          <a:schemeClr val="accent1"/>
-        </a:lnRef>
-        <a:fillRef idx="0">
-          <a:schemeClr val="accent1"/>
-        </a:fillRef>
-        <a:effectRef idx="1">
-          <a:schemeClr val="accent1"/>
-        </a:effectRef>
-        <a:fontRef idx="minor">
-          <a:schemeClr val="tx1"/>
-        </a:fontRef>
-      </a:style>
-    </a:lnDef>
-  </a:objectDefaults>
+  <a:objectDefaults/>
   <a:extraClrSchemeLst/>
+  <a:extLst>
+    <a:ext uri="{05A4C25C-085E-4340-85A3-A5531E510DB2}">
+      <thm15:themeFamily xmlns:thm15="http://schemas.microsoft.com/office/thememl/2012/main" name="Office Theme" id="{2E142A2C-CD16-42D6-873A-C26D2A0506FA}" vid="{1BDDFF52-6CD6-40A5-AB3C-68EB2F1E4D0A}"/>
+    </a:ext>
+  </a:extLst>
 </a:theme>
 </file>
</xml_diff>